<commit_message>
Paula QS Parte 4: revisão
Co-Authored-By: Claude Opus 5.5 <noreply@anthropic.com>
Claude-Session: https://claude.ai/code/session_01MJjUEEZrxQDEUifKK2vj9g
</commit_message>
<xml_diff>
--- a/roteiros/paula-fernandes-2/PaulaQS_Parte4.docx
+++ b/roteiros/paula-fernandes-2/PaulaQS_Parte4.docx
@@ -55,7 +55,7 @@
         <w:rPr>
           <w:color w:val="000000"/>
         </w:rPr>
-        <w:t>Segundo Roberta, Paula tinha humilhado o diretor do DVD dela, um rapaz chamado Thiago, da produtora TS Music. Roberta disse que o rapaz chorou muito. E que aquela não tinha sido a primeira vez. Segundo ela, já tinha visto Paula humilhar outras pessoas, inclusive patrocinadores.</w:t>
+        <w:t>Segundo Roberta, Paula tinha humilhado o diretor do DVD dela. Roberta disse que o rapaz chorou muito. E que aquela não tinha sido a primeira vez. Segundo ela, já tinha visto Paula humilhar outras pessoas, inclusive patrocinadores.</w:t>
       </w:r>
     </w:p>
     <w:p>
@@ -64,14 +64,6 @@
           <w:color w:val="000000"/>
         </w:rPr>
         <w:t>Para Roberta, o episódio com o diretor tinha sido a gota d'água.</w:t>
-      </w:r>
-    </w:p>
-    <w:p>
-      <w:r>
-        <w:rPr>
-          <w:color w:val="000000"/>
-        </w:rPr>
-        <w:t>Em outra ocasião, Roberta também deu a entender que a cantora mais nova copiava o jeito dela de se vestir e de falar com o público no palco. Para Roberta, aquilo era uma falta de respeito.</w:t>
       </w:r>
     </w:p>
     <w:p>
@@ -103,7 +95,7 @@
         <w:rPr>
           <w:color w:val="000000"/>
         </w:rPr>
-        <w:t>Elogiou a carreira de Roberta. Disse que pedaços da vida de alguém, vistos de fora, podem criar uma impressão falsa. E explicou que muitas das situações de bastidores daquela época tinham sido causadas pela equipe antiga dela.</w:t>
+        <w:t>Elogiou a carreira de Roberta. Disse que pedaços da vida de alguém, vistos de fora, podem criar uma impressão falsa. E voltou à mesma explicação que dava desde os tempos do rótulo. Muitas das situações de bastidores daquela época tinham sido causadas pela equipe antiga dela.</w:t>
       </w:r>
     </w:p>
     <w:p>

</xml_diff>